<commit_message>
Prepare the Digis Laravel application and publish 43 match analyses
Regenerate the Digis package through the two-wave prepare workflow with terra_medium provenance. Preserve and publish the existing refreshed match-analysis batch. Validation: 214 unit tests passed; prohibited OpenAI API scan clean.
</commit_message>
<xml_diff>
--- a/registry/jobs/2026-08-07_140606_digis-a-fiverr-company-nyse-fvrr_senior-laravel-developer/application/cover-letter.docx
+++ b/registry/jobs/2026-08-07_140606_digis-a-fiverr-company-nyse-fvrr_senior-laravel-developer/application/cover-letter.docx
@@ -33,87 +33,100 @@
           <w:szCs w:val="24"/>
           <w:rtl w:val="false"/>
         </w:rPr>
-        <w:t xml:space="preserve">A housing operations platform that coordinates repairs, contractors, integrations, and resident communication depends on reliable application code and engineers who understand operational consequences. My background fits that work through long-term PHP/Laravel development, production troubleshooting, backend integrations, and technical ownership across established SaaS products.</w:t>
-      </w:r>
-    </w:p>
-    <w:p>
-      <w:pPr>
-        <w:bidi w:val="false"/>
-        <w:spacing w:after="120" w:before="120" w:line="259.20000000000005"/>
-        <w:jc w:val="left"/>
-      </w:pPr>
-      <w:r>
-        <w:rPr>
-          <w:rFonts w:ascii="Aptos" w:cs="Aptos" w:eastAsia="Aptos" w:hAnsi="Aptos"/>
-          <w:color w:val="000000"/>
-          <w:sz w:val="24"/>
-          <w:szCs w:val="24"/>
-          <w:rtl w:val="false"/>
-        </w:rPr>
-        <w:t xml:space="preserve">At airSlate, I developed Laravel/Symfony backend components, improved database and API performance, investigated production defects, and supported releases from planning through deployment. I also helped move services from ECS to Kubernetes and built delivery workflows with GitHub Actions, Helm, and ArgoCD. In my recent work, I owned integrations between customer-support systems and internal services, building resilient message delivery with retries, fallbacks, and monitoring.</w:t>
-      </w:r>
-    </w:p>
-    <w:p>
-      <w:pPr>
-        <w:bidi w:val="false"/>
-        <w:spacing w:after="120" w:before="120" w:line="259.20000000000005"/>
-        <w:jc w:val="left"/>
-      </w:pPr>
-      <w:r>
-        <w:rPr>
-          <w:rFonts w:ascii="Aptos" w:cs="Aptos" w:eastAsia="Aptos" w:hAnsi="Aptos"/>
-          <w:color w:val="000000"/>
-          <w:sz w:val="24"/>
-          <w:szCs w:val="24"/>
-          <w:rtl w:val="false"/>
-        </w:rPr>
-        <w:t xml:space="preserve">I have led engineering teams, reviewed technical decisions, mentored developers, and worked directly with product and operational stakeholders. That experience would help me contribute to client-specific implementations and share useful product context across engineering groups.</w:t>
-      </w:r>
-    </w:p>
-    <w:p>
-      <w:pPr>
-        <w:bidi w:val="false"/>
-        <w:spacing w:after="120" w:before="120" w:line="259.20000000000005"/>
-        <w:jc w:val="left"/>
-      </w:pPr>
-      <w:r>
-        <w:rPr>
-          <w:rFonts w:ascii="Aptos" w:cs="Aptos" w:eastAsia="Aptos" w:hAnsi="Aptos"/>
-          <w:color w:val="000000"/>
-          <w:sz w:val="24"/>
-          <w:szCs w:val="24"/>
-          <w:rtl w:val="false"/>
-        </w:rPr>
-        <w:t xml:space="preserve">I would welcome a conversation about the platform, the current Laravel architecture, and how the team divides work across backend and user-facing features.</w:t>
-      </w:r>
-    </w:p>
-    <w:p>
-      <w:pPr>
-        <w:bidi w:val="false"/>
-        <w:spacing w:after="120" w:before="120" w:line="259.20000000000005"/>
-        <w:jc w:val="left"/>
-      </w:pPr>
-      <w:r>
-        <w:rPr>
-          <w:rFonts w:ascii="Aptos" w:cs="Aptos" w:eastAsia="Aptos" w:hAnsi="Aptos"/>
-          <w:color w:val="000000"/>
-          <w:sz w:val="24"/>
-          <w:szCs w:val="24"/>
-          <w:rtl w:val="false"/>
-        </w:rPr>
-        <w:t xml:space="preserve">Kind regards,</w:t>
-      </w:r>
-      <w:r>
-        <w:rPr>
-          <w:rFonts w:ascii="Aptos" w:cs="Aptos" w:eastAsia="Aptos" w:hAnsi="Aptos"/>
-          <w:color w:val="000000"/>
-          <w:sz w:val="24"/>
-          <w:szCs w:val="24"/>
-          <w:rtl w:val="false"/>
-        </w:rPr>
-        <w:t xml:space="preserve">
-</w:t>
-      </w:r>
+        <w:t xml:space="preserve">I am applying for the Senior Laravel Developer role at Digis. I am a senior PHP/Laravel backend engineer with more than 15 years of software development experience across SaaS products, integrations, document automation, and high-volume communications systems. The opportunity to contribute to a mature housing operations platform through Digis's model of engineers integrating into client teams aligns well with my background in reliable backend services and pragmatic technical ownership.</w:t>
+      </w:r>
+    </w:p>
+    <w:p>
+      <w:pPr>
+        <w:bidi w:val="false"/>
+        <w:spacing w:after="120" w:before="120" w:line="259.20000000000005"/>
+        <w:jc w:val="left"/>
+      </w:pPr>
+      <w:r>
+        <w:rPr>
+          <w:rFonts w:ascii="Aptos" w:cs="Aptos" w:eastAsia="Aptos" w:hAnsi="Aptos"/>
+          <w:color w:val="000000"/>
+          <w:sz w:val="24"/>
+          <w:szCs w:val="24"/>
+          <w:rtl w:val="false"/>
+        </w:rPr>
+        <w:t xml:space="preserve">At airSlate, I developed Laravel/Symfony backend services and a product-wide logging package aligned with interservice communication standards. When database and API bottlenecks affected peak-time performance, I investigated and optimized the relevant workloads, lowering peak load on the main database to 65% and improving average API response time by 30%. This experience strengthened my ability to diagnose defects methodically, improve established services safely, and keep operational reliability central to day-to-day development.</w:t>
+      </w:r>
+    </w:p>
+    <w:p>
+      <w:pPr>
+        <w:bidi w:val="false"/>
+        <w:spacing w:after="120" w:before="120" w:line="259.20000000000005"/>
+        <w:jc w:val="left"/>
+      </w:pPr>
+      <w:r>
+        <w:rPr>
+          <w:rFonts w:ascii="Aptos" w:cs="Aptos" w:eastAsia="Aptos" w:hAnsi="Aptos"/>
+          <w:color w:val="000000"/>
+          <w:sz w:val="24"/>
+          <w:szCs w:val="24"/>
+          <w:rtl w:val="false"/>
+        </w:rPr>
+        <w:t xml:space="preserve">I have also combined hands-on Laravel engineering with technical leadership in high-throughput systems. At PDFfiller, I led five backend engineers building a Laravel-based transactional email service, helped scale it to approximately 50 million emails per month, and supported peak periods with more than ten times normal traffic. Alongside delivery, I made key technical decisions and coached team members. That balance of implementation, decision-making, and knowledge sharing matches the collaborative responsibilities of the Diagnostics and wider engineering teams.</w:t>
+      </w:r>
+    </w:p>
+    <w:p>
+      <w:pPr>
+        <w:bidi w:val="false"/>
+        <w:spacing w:after="120" w:before="120" w:line="259.20000000000005"/>
+        <w:jc w:val="left"/>
+      </w:pPr>
+      <w:r>
+        <w:rPr>
+          <w:rFonts w:ascii="Aptos" w:cs="Aptos" w:eastAsia="Aptos" w:hAnsi="Aptos"/>
+          <w:color w:val="000000"/>
+          <w:sz w:val="24"/>
+          <w:szCs w:val="24"/>
+          <w:rtl w:val="false"/>
+        </w:rPr>
+        <w:t xml:space="preserve">What interests me most about this role is its practical breadth: maintaining product features, improving administrative workflows, resolving issues across backend and integration services, and supporting client-specific implementations. I value clear ownership, maintainable architecture, and close collaboration with product and engineering colleagues, especially when evolving an established SaaS platform without compromising reliability.</w:t>
+      </w:r>
+    </w:p>
+    <w:p>
+      <w:pPr>
+        <w:bidi w:val="false"/>
+        <w:spacing w:after="120" w:before="120" w:line="259.20000000000005"/>
+        <w:jc w:val="left"/>
+      </w:pPr>
+      <w:r>
+        <w:rPr>
+          <w:rFonts w:ascii="Aptos" w:cs="Aptos" w:eastAsia="Aptos" w:hAnsi="Aptos"/>
+          <w:color w:val="000000"/>
+          <w:sz w:val="24"/>
+          <w:szCs w:val="24"/>
+          <w:rtl w:val="false"/>
+        </w:rPr>
+        <w:t xml:space="preserve">I would welcome the opportunity to discuss how my Laravel background, production problem-solving, and technical leadership could contribute to Digis and the team delivering this platform.</w:t>
+      </w:r>
+    </w:p>
+    <w:p>
+      <w:pPr>
+        <w:bidi w:val="false"/>
+        <w:spacing w:after="120" w:before="120" w:line="259.20000000000005"/>
+        <w:jc w:val="left"/>
+      </w:pPr>
+      <w:r>
+        <w:rPr>
+          <w:rFonts w:ascii="Aptos" w:cs="Aptos" w:eastAsia="Aptos" w:hAnsi="Aptos"/>
+          <w:color w:val="000000"/>
+          <w:sz w:val="24"/>
+          <w:szCs w:val="24"/>
+          <w:rtl w:val="false"/>
+        </w:rPr>
+        <w:t xml:space="preserve">Sincerely,</w:t>
+      </w:r>
+    </w:p>
+    <w:p>
+      <w:pPr>
+        <w:bidi w:val="false"/>
+        <w:spacing w:after="120" w:before="120" w:line="259.20000000000005"/>
+        <w:jc w:val="left"/>
+      </w:pPr>
       <w:r>
         <w:rPr>
           <w:rFonts w:ascii="Aptos" w:cs="Aptos" w:eastAsia="Aptos" w:hAnsi="Aptos"/>

</xml_diff>